<commit_message>
Changed the GIT guide  and added a FormChangeRequestGuide guidance  document
</commit_message>
<xml_diff>
--- a/VerySimpleGuideToUsingGit.docx
+++ b/VerySimpleGuideToUsingGit.docx
@@ -22,8 +22,13 @@
     </w:p>
     <w:p>
       <w:r>
-        <w:t>Open GitHub Desktop :</w:t>
-      </w:r>
+        <w:t xml:space="preserve">Open GitHub </w:t>
+      </w:r>
+      <w:proofErr w:type="gramStart"/>
+      <w:r>
+        <w:t>Desktop :</w:t>
+      </w:r>
+      <w:proofErr w:type="gramEnd"/>
     </w:p>
     <w:p/>
     <w:p>
@@ -147,8 +152,23 @@
     </w:p>
     <w:p>
       <w:r>
-        <w:t>This will copy the entire content of the repository to you local machine and allow the folder it’s downloaded to the ability to sync with the repository, the screen below will be shown. To view the local directory, click :</w:t>
-      </w:r>
+        <w:t xml:space="preserve">This will copy the entire content of the repository to </w:t>
+      </w:r>
+      <w:proofErr w:type="spellStart"/>
+      <w:proofErr w:type="gramStart"/>
+      <w:r>
+        <w:t>you</w:t>
+      </w:r>
+      <w:proofErr w:type="spellEnd"/>
+      <w:proofErr w:type="gramEnd"/>
+      <w:r>
+        <w:t xml:space="preserve"> local machine and allow the folder it’s downloaded to the ability to sync with the repository, the screen below will be shown. To view the local directory, </w:t>
+      </w:r>
+      <w:proofErr w:type="gramStart"/>
+      <w:r>
+        <w:t>click :</w:t>
+      </w:r>
+      <w:proofErr w:type="gramEnd"/>
     </w:p>
     <w:p/>
     <w:p>
@@ -311,10 +331,18 @@
         <w:t>In this folder create / copy</w:t>
       </w:r>
       <w:r>
-        <w:t xml:space="preserve"> / edit </w:t>
-      </w:r>
-      <w:r>
-        <w:t xml:space="preserve"> the files you want to add </w:t>
+        <w:t xml:space="preserve"> / </w:t>
+      </w:r>
+      <w:proofErr w:type="gramStart"/>
+      <w:r>
+        <w:t xml:space="preserve">edit </w:t>
+      </w:r>
+      <w:r>
+        <w:t xml:space="preserve"> the</w:t>
+      </w:r>
+      <w:proofErr w:type="gramEnd"/>
+      <w:r>
+        <w:t xml:space="preserve"> files you want to add </w:t>
       </w:r>
       <w:r>
         <w:t xml:space="preserve">or change in </w:t>
@@ -398,11 +426,16 @@
     </w:p>
     <w:p>
       <w:r>
-        <w:t>The files which will being added / removed or changed are listed on the left side of the screen</w:t>
+        <w:t xml:space="preserve">The files which will being added / removed or changed are listed on the left side of the </w:t>
+      </w:r>
+      <w:proofErr w:type="spellStart"/>
+      <w:r>
+        <w:t>screen</w:t>
       </w:r>
       <w:r>
         <w:t>a</w:t>
       </w:r>
+      <w:proofErr w:type="spellEnd"/>
     </w:p>
     <w:p/>
     <w:p>
@@ -537,11 +570,24 @@
           <w:noProof/>
         </w:rPr>
       </w:pPr>
-      <w:r>
-        <w:t xml:space="preserve">In order to get the link to use in your form </w:t>
-      </w:r>
-      <w:r>
-        <w:t>click View on Github (or press Ctrl-Shift-G:</w:t>
+      <w:proofErr w:type="gramStart"/>
+      <w:r>
+        <w:t>In order to</w:t>
+      </w:r>
+      <w:proofErr w:type="gramEnd"/>
+      <w:r>
+        <w:t xml:space="preserve"> get the link to use in your form </w:t>
+      </w:r>
+      <w:r>
+        <w:t xml:space="preserve">click View on </w:t>
+      </w:r>
+      <w:proofErr w:type="spellStart"/>
+      <w:r>
+        <w:t>Github</w:t>
+      </w:r>
+      <w:proofErr w:type="spellEnd"/>
+      <w:r>
+        <w:t xml:space="preserve"> (or press Ctrl-Shift-G:</w:t>
       </w:r>
       <w:r>
         <w:rPr>
@@ -811,10 +857,18 @@
         </w:drawing>
       </w:r>
     </w:p>
-    <w:p/>
-    <w:p>
-      <w:r>
-        <w:t>One of the big advantages of Git is that changes are logged and can be reverted if needed, it provides full version control of any and all changes.</w:t>
+    <w:p>
+      <w:r>
+        <w:lastRenderedPageBreak/>
+        <w:t xml:space="preserve">One of the big advantages of Git is that changes are logged and can be reverted if needed, it provides full version control of </w:t>
+      </w:r>
+      <w:proofErr w:type="gramStart"/>
+      <w:r>
+        <w:t>any and all</w:t>
+      </w:r>
+      <w:proofErr w:type="gramEnd"/>
+      <w:r>
+        <w:t xml:space="preserve"> changes.</w:t>
       </w:r>
       <w:r>
         <w:t xml:space="preserve"> It also allows multiple people to work on the same things without interfering with each other’s work</w:t>

</xml_diff>